<commit_message>
Align portfolio and resume content across all formats
</commit_message>
<xml_diff>
--- a/resume_final.docx
+++ b/resume_final.docx
@@ -43,20 +43,33 @@
             <w:r>
               <w:rPr>
                 <w:rFonts w:ascii="微软雅黑" w:hAnsi="微软雅黑" w:eastAsia="微软雅黑"/>
+                <w:b w:val="0"/>
                 <w:color w:val="2563EB"/>
                 <w:sz w:val="24"/>
               </w:rPr>
-              <w:t>Java后端开发实习生  |  南京  |  可远程</w:t>
+              <w:t>Java 后端开发实习生  |  南京  |  可远程</w:t>
             </w:r>
           </w:p>
           <w:p>
             <w:r>
               <w:rPr>
                 <w:rFonts w:ascii="微软雅黑" w:hAnsi="微软雅黑" w:eastAsia="微软雅黑"/>
+                <w:b w:val="0"/>
                 <w:color w:val="555555"/>
                 <w:sz w:val="22"/>
               </w:rPr>
-              <w:t>18761851809  |  1079086024@qq.com  |  南京</w:t>
+              <w:t>18761851809  |  1079086024@qq.com  |  github.com/Teku715</w:t>
+            </w:r>
+          </w:p>
+          <w:p>
+            <w:r>
+              <w:rPr>
+                <w:rFonts w:ascii="微软雅黑" w:hAnsi="微软雅黑" w:eastAsia="微软雅黑"/>
+                <w:b w:val="0"/>
+                <w:color w:val="555555"/>
+                <w:sz w:val="20"/>
+              </w:rPr>
+              <w:t>南京邮电大学 · 物联网学院 · 网络工程 · 2025级 · 大一</w:t>
             </w:r>
           </w:p>
         </w:tc>
@@ -138,6 +151,8 @@
       </w:r>
       <w:r>
         <w:rPr>
+          <w:rFonts w:ascii="微软雅黑" w:hAnsi="微软雅黑" w:eastAsia="微软雅黑"/>
+          <w:b w:val="0"/>
           <w:color w:val="888888"/>
           <w:sz w:val="20"/>
         </w:rPr>
@@ -151,10 +166,11 @@
       <w:r>
         <w:rPr>
           <w:rFonts w:ascii="微软雅黑" w:hAnsi="微软雅黑" w:eastAsia="微软雅黑"/>
+          <w:b w:val="0"/>
           <w:color w:val="444444"/>
           <w:sz w:val="20"/>
         </w:rPr>
-        <w:t>物联网学院 · 网络工程  |  GPA 3.15 / 4.0  |  英语四级</w:t>
+        <w:t>物联网学院 · 网络工程  |  GPA 3.15 / 4.0  |  英语四级已通过</w:t>
       </w:r>
     </w:p>
     <w:p>
@@ -184,15 +200,16 @@
           <w:b/>
           <w:sz w:val="20"/>
         </w:rPr>
-        <w:t>Java后端：</w:t>
+        <w:t>Java 后端：</w:t>
       </w:r>
       <w:r>
         <w:rPr>
           <w:rFonts w:ascii="微软雅黑" w:hAnsi="微软雅黑" w:eastAsia="微软雅黑"/>
+          <w:b w:val="0"/>
           <w:color w:val="444444"/>
           <w:sz w:val="20"/>
         </w:rPr>
-        <w:t>Spring Boot / MySQL / MyBatis / H2数据库 / 接口开发</w:t>
+        <w:t>Spring Boot / RESTful API / MySQL / MyBatis / JWT / Spring AOP</w:t>
       </w:r>
     </w:p>
     <w:p>
@@ -205,15 +222,16 @@
           <w:b/>
           <w:sz w:val="20"/>
         </w:rPr>
-        <w:t>AI辅助开发：</w:t>
+        <w:t>AI &amp; 大模型：</w:t>
       </w:r>
       <w:r>
         <w:rPr>
           <w:rFonts w:ascii="微软雅黑" w:hAnsi="微软雅黑" w:eastAsia="微软雅黑"/>
+          <w:b w:val="0"/>
           <w:color w:val="444444"/>
           <w:sz w:val="20"/>
         </w:rPr>
-        <w:t>Vibe Coding / GitHub Copilot / Coze平台 / 硅基流动API(Qwen2.5-7B)</w:t>
+        <w:t>硅基流动 Qwen2.5 / SenseVoice / AI 辅助编程 / Copilot / Coze</w:t>
       </w:r>
     </w:p>
     <w:p>
@@ -231,117 +249,11 @@
       <w:r>
         <w:rPr>
           <w:rFonts w:ascii="微软雅黑" w:hAnsi="微软雅黑" w:eastAsia="微软雅黑"/>
+          <w:b w:val="0"/>
           <w:color w:val="444444"/>
           <w:sz w:val="20"/>
         </w:rPr>
-        <w:t>Vue3 / Element Plus / Vite / Git / Docker</w:t>
-      </w:r>
-    </w:p>
-    <w:p>
-      <w:pPr>
-        <w:spacing w:before="200" w:after="80"/>
-        <w:pBdr>
-          <w:bottom w:val="single" w:sz="6" w:space="1" w:color="2563EB"/>
-        </w:pBdr>
-      </w:pPr>
-      <w:r>
-        <w:rPr>
-          <w:rFonts w:ascii="微软雅黑" w:hAnsi="微软雅黑" w:eastAsia="微软雅黑"/>
-          <w:b/>
-          <w:color w:val="1A1A2E"/>
-          <w:sz w:val="26"/>
-        </w:rPr>
-        <w:t>比赛经历</w:t>
-      </w:r>
-    </w:p>
-    <w:p>
-      <w:pPr>
-        <w:spacing w:before="40" w:after="20"/>
-      </w:pPr>
-      <w:r>
-        <w:rPr>
-          <w:rFonts w:ascii="微软雅黑" w:hAnsi="微软雅黑" w:eastAsia="微软雅黑"/>
-          <w:b/>
-          <w:sz w:val="22"/>
-        </w:rPr>
-        <w:t>中兴捧月 · 校园课程助手智能体（兴享智家）</w:t>
-      </w:r>
-      <w:r>
-        <w:rPr>
-          <w:color w:val="888888"/>
-          <w:sz w:val="20"/>
-        </w:rPr>
-        <w:t xml:space="preserve">  2026.05</w:t>
-      </w:r>
-    </w:p>
-    <w:p>
-      <w:pPr>
-        <w:spacing w:before="40" w:after="20"/>
-      </w:pPr>
-      <w:r>
-        <w:rPr>
-          <w:rFonts w:ascii="微软雅黑" w:hAnsi="微软雅黑" w:eastAsia="微软雅黑"/>
-          <w:b/>
-          <w:sz w:val="22"/>
-        </w:rPr>
-      </w:r>
-    </w:p>
-    <w:p>
-      <w:pPr>
-        <w:spacing w:before="20" w:after="40"/>
-      </w:pPr>
-      <w:r>
-        <w:rPr>
-          <w:rFonts w:ascii="微软雅黑" w:hAnsi="微软雅黑" w:eastAsia="微软雅黑"/>
-          <w:color w:val="444444"/>
-          <w:sz w:val="20"/>
-        </w:rPr>
-        <w:t>AI智能助手，接入硅基流动Qwen2.5-7B，可查课程表、查成绩、问答。独立完成前后端开发，Java/Spring Boot后端5个接口，Vue3前端。</w:t>
-      </w:r>
-    </w:p>
-    <w:p>
-      <w:pPr>
-        <w:spacing w:before="40" w:after="20"/>
-      </w:pPr>
-      <w:r>
-        <w:rPr>
-          <w:rFonts w:ascii="微软雅黑" w:hAnsi="微软雅黑" w:eastAsia="微软雅黑"/>
-          <w:b/>
-          <w:sz w:val="22"/>
-        </w:rPr>
-        <w:t>计算机设计大赛 · 老人信息管理系统</w:t>
-      </w:r>
-      <w:r>
-        <w:rPr>
-          <w:color w:val="888888"/>
-          <w:sz w:val="20"/>
-        </w:rPr>
-        <w:t xml:space="preserve">  2026.04</w:t>
-      </w:r>
-    </w:p>
-    <w:p>
-      <w:pPr>
-        <w:spacing w:before="40" w:after="20"/>
-      </w:pPr>
-      <w:r>
-        <w:rPr>
-          <w:rFonts w:ascii="微软雅黑" w:hAnsi="微软雅黑" w:eastAsia="微软雅黑"/>
-          <w:b/>
-          <w:sz w:val="22"/>
-        </w:rPr>
-      </w:r>
-    </w:p>
-    <w:p>
-      <w:pPr>
-        <w:spacing w:before="20" w:after="40"/>
-      </w:pPr>
-      <w:r>
-        <w:rPr>
-          <w:rFonts w:ascii="微软雅黑" w:hAnsi="微软雅黑" w:eastAsia="微软雅黑"/>
-          <w:color w:val="444444"/>
-          <w:sz w:val="20"/>
-        </w:rPr>
-        <w:t>独立完成Java后端开发，提供5个REST API接口（增删改查），MySQL数据库。</w:t>
+        <w:t>Vue3 / Element Plus / Vite / Git / Docker / Maven</w:t>
       </w:r>
     </w:p>
     <w:p>
@@ -371,14 +283,58 @@
           <w:b/>
           <w:sz w:val="22"/>
         </w:rPr>
-        <w:t>星火工作室考核 · CStudyMate C语言AI学伴</w:t>
+        <w:t>七牛云 XEngineer · 丝路声绘 · Silk VoiceBrush（AI 英语口语陪练）</w:t>
       </w:r>
       <w:r>
         <w:rPr>
+          <w:rFonts w:ascii="微软雅黑" w:hAnsi="微软雅黑" w:eastAsia="微软雅黑"/>
+          <w:b w:val="0"/>
           <w:color w:val="888888"/>
           <w:sz w:val="20"/>
         </w:rPr>
-        <w:t xml:space="preserve">  2026.05</w:t>
+        <w:t xml:space="preserve">  2026.06</w:t>
+      </w:r>
+    </w:p>
+    <w:p>
+      <w:pPr>
+        <w:pStyle w:val="ListBullet"/>
+      </w:pPr>
+      <w:r>
+        <w:rPr>
+          <w:rFonts w:ascii="微软雅黑" w:hAnsi="微软雅黑" w:eastAsia="微软雅黑"/>
+          <w:b w:val="0"/>
+          <w:color w:val="444444"/>
+          <w:sz w:val="20"/>
+        </w:rPr>
+        <w:t>独立完成后端架构，集成 SenseVoice 语音识别与 Qwen 大模型，实现多场景口语练习全流程</w:t>
+      </w:r>
+    </w:p>
+    <w:p>
+      <w:pPr>
+        <w:pStyle w:val="ListBullet"/>
+      </w:pPr>
+      <w:r>
+        <w:rPr>
+          <w:rFonts w:ascii="微软雅黑" w:hAnsi="微软雅黑" w:eastAsia="微软雅黑"/>
+          <w:b w:val="0"/>
+          <w:color w:val="444444"/>
+          <w:sz w:val="20"/>
+        </w:rPr>
+        <w:t>设计场景对话、按住说话、表达评测、课后总结等核心模块，完成前后端联调与部署</w:t>
+      </w:r>
+    </w:p>
+    <w:p>
+      <w:pPr>
+        <w:pStyle w:val="ListBullet"/>
+      </w:pPr>
+      <w:r>
+        <w:rPr>
+          <w:rFonts w:ascii="微软雅黑" w:hAnsi="微软雅黑" w:eastAsia="微软雅黑"/>
+          <w:b w:val="0"/>
+          <w:color w:val="444444"/>
+          <w:sz w:val="20"/>
+        </w:rPr>
+        <w:t>支持面试 / 餐厅 / 会议 / 旅行 / 购物 5 类场景，涵盖 ASR、TTS、角色扮演与打字机回复</w:t>
       </w:r>
     </w:p>
     <w:p>
@@ -391,19 +347,122 @@
           <w:b/>
           <w:sz w:val="22"/>
         </w:rPr>
+        <w:t>中兴捧月 · 兴享智家（校园课程助手智能体）</w:t>
+      </w:r>
+      <w:r>
+        <w:rPr>
+          <w:rFonts w:ascii="微软雅黑" w:hAnsi="微软雅黑" w:eastAsia="微软雅黑"/>
+          <w:b w:val="0"/>
+          <w:color w:val="888888"/>
+          <w:sz w:val="20"/>
+        </w:rPr>
+        <w:t xml:space="preserve">  2026.05</w:t>
       </w:r>
     </w:p>
     <w:p>
       <w:pPr>
-        <w:spacing w:before="20" w:after="40"/>
+        <w:pStyle w:val="ListBullet"/>
       </w:pPr>
       <w:r>
         <w:rPr>
           <w:rFonts w:ascii="微软雅黑" w:hAnsi="微软雅黑" w:eastAsia="微软雅黑"/>
+          <w:b w:val="0"/>
           <w:color w:val="444444"/>
           <w:sz w:val="20"/>
         </w:rPr>
-        <w:t>Spring Boot + MyBatis + H2数据库，前端Vue3 + Element Plus，接入硅基流动Qwen2.5-7B实现AI问答。完成功能：AI问答、学情统计、练习中心。</w:t>
+        <w:t>独立完成前后端开发，接入 Qwen2.5-7B 实现 AI 对话，支持查课程表、查成绩、智能问答</w:t>
+      </w:r>
+    </w:p>
+    <w:p>
+      <w:pPr>
+        <w:pStyle w:val="ListBullet"/>
+      </w:pPr>
+      <w:r>
+        <w:rPr>
+          <w:rFonts w:ascii="微软雅黑" w:hAnsi="微软雅黑" w:eastAsia="微软雅黑"/>
+          <w:b w:val="0"/>
+          <w:color w:val="444444"/>
+          <w:sz w:val="20"/>
+        </w:rPr>
+        <w:t>后端提供 RESTful 接口，前端基于 Vue3 + Element Plus 完成交互与数据展示</w:t>
+      </w:r>
+    </w:p>
+    <w:p>
+      <w:pPr>
+        <w:pStyle w:val="ListBullet"/>
+      </w:pPr>
+      <w:r>
+        <w:rPr>
+          <w:rFonts w:ascii="微软雅黑" w:hAnsi="微软雅黑" w:eastAsia="微软雅黑"/>
+          <w:b w:val="0"/>
+          <w:color w:val="444444"/>
+          <w:sz w:val="20"/>
+        </w:rPr>
+        <w:t>完成从需求分析、接口设计到联调上线的完整开发流程</w:t>
+      </w:r>
+    </w:p>
+    <w:p>
+      <w:pPr>
+        <w:spacing w:before="40" w:after="20"/>
+      </w:pPr>
+      <w:r>
+        <w:rPr>
+          <w:rFonts w:ascii="微软雅黑" w:hAnsi="微软雅黑" w:eastAsia="微软雅黑"/>
+          <w:b/>
+          <w:sz w:val="22"/>
+        </w:rPr>
+        <w:t>星火工作室考核 · CStudyMate C语言 AI 学伴</w:t>
+      </w:r>
+      <w:r>
+        <w:rPr>
+          <w:rFonts w:ascii="微软雅黑" w:hAnsi="微软雅黑" w:eastAsia="微软雅黑"/>
+          <w:b w:val="0"/>
+          <w:color w:val="888888"/>
+          <w:sz w:val="20"/>
+        </w:rPr>
+        <w:t xml:space="preserve">  2026.05</w:t>
+      </w:r>
+    </w:p>
+    <w:p>
+      <w:pPr>
+        <w:pStyle w:val="ListBullet"/>
+      </w:pPr>
+      <w:r>
+        <w:rPr>
+          <w:rFonts w:ascii="微软雅黑" w:hAnsi="微软雅黑" w:eastAsia="微软雅黑"/>
+          <w:b w:val="0"/>
+          <w:color w:val="444444"/>
+          <w:sz w:val="20"/>
+        </w:rPr>
+        <w:t>后端基于 Spring Boot + MyBatis 实现 RESTful API，前端完成 AI 问答、练习中心、学情统计等模块</w:t>
+      </w:r>
+    </w:p>
+    <w:p>
+      <w:pPr>
+        <w:pStyle w:val="ListBullet"/>
+      </w:pPr>
+      <w:r>
+        <w:rPr>
+          <w:rFonts w:ascii="微软雅黑" w:hAnsi="微软雅黑" w:eastAsia="微软雅黑"/>
+          <w:b w:val="0"/>
+          <w:color w:val="444444"/>
+          <w:sz w:val="20"/>
+        </w:rPr>
+        <w:t>接入 Qwen2.5-7B，设计结构化 Prompt，强制输出概念 / 原理 / 代码 / 易错点</w:t>
+      </w:r>
+    </w:p>
+    <w:p>
+      <w:pPr>
+        <w:pStyle w:val="ListBullet"/>
+      </w:pPr>
+      <w:r>
+        <w:rPr>
+          <w:rFonts w:ascii="微软雅黑" w:hAnsi="微软雅黑" w:eastAsia="微软雅黑"/>
+          <w:b w:val="0"/>
+          <w:color w:val="444444"/>
+          <w:sz w:val="20"/>
+        </w:rPr>
+        <w:t>实现问答历史、练习记录等学习闭环功能，完成前后端联调</w:t>
       </w:r>
     </w:p>
     <w:p>
@@ -420,10 +479,54 @@
       </w:r>
       <w:r>
         <w:rPr>
+          <w:rFonts w:ascii="微软雅黑" w:hAnsi="微软雅黑" w:eastAsia="微软雅黑"/>
+          <w:b w:val="0"/>
           <w:color w:val="888888"/>
           <w:sz w:val="20"/>
         </w:rPr>
         <w:t xml:space="preserve">  2026.03</w:t>
+      </w:r>
+    </w:p>
+    <w:p>
+      <w:pPr>
+        <w:pStyle w:val="ListBullet"/>
+      </w:pPr>
+      <w:r>
+        <w:rPr>
+          <w:rFonts w:ascii="微软雅黑" w:hAnsi="微软雅黑" w:eastAsia="微软雅黑"/>
+          <w:b w:val="0"/>
+          <w:color w:val="444444"/>
+          <w:sz w:val="20"/>
+        </w:rPr>
+        <w:t>实现基于 JWT 的用户登录认证与令牌鉴权，Filter 拦截未授权请求</w:t>
+      </w:r>
+    </w:p>
+    <w:p>
+      <w:pPr>
+        <w:pStyle w:val="ListBullet"/>
+      </w:pPr>
+      <w:r>
+        <w:rPr>
+          <w:rFonts w:ascii="微软雅黑" w:hAnsi="微软雅黑" w:eastAsia="微软雅黑"/>
+          <w:b w:val="0"/>
+          <w:color w:val="444444"/>
+          <w:sz w:val="20"/>
+        </w:rPr>
+        <w:t>使用 Spring AOP 统一记录操作日志，完成部门、员工等管理模块接口开发</w:t>
+      </w:r>
+    </w:p>
+    <w:p>
+      <w:pPr>
+        <w:pStyle w:val="ListBullet"/>
+      </w:pPr>
+      <w:r>
+        <w:rPr>
+          <w:rFonts w:ascii="微软雅黑" w:hAnsi="微软雅黑" w:eastAsia="微软雅黑"/>
+          <w:b w:val="0"/>
+          <w:color w:val="444444"/>
+          <w:sz w:val="20"/>
+        </w:rPr>
+        <w:t>独立完成前后端联调与功能测试</w:t>
       </w:r>
     </w:p>
     <w:p>
@@ -436,19 +539,44 @@
           <w:b/>
           <w:sz w:val="22"/>
         </w:rPr>
+        <w:t>计算机设计大赛 · 老人信息管理系统</w:t>
+      </w:r>
+      <w:r>
+        <w:rPr>
+          <w:rFonts w:ascii="微软雅黑" w:hAnsi="微软雅黑" w:eastAsia="微软雅黑"/>
+          <w:b w:val="0"/>
+          <w:color w:val="888888"/>
+          <w:sz w:val="20"/>
+        </w:rPr>
+        <w:t xml:space="preserve">  2026.04</w:t>
       </w:r>
     </w:p>
     <w:p>
       <w:pPr>
-        <w:spacing w:before="20" w:after="40"/>
+        <w:pStyle w:val="ListBullet"/>
       </w:pPr>
       <w:r>
         <w:rPr>
           <w:rFonts w:ascii="微软雅黑" w:hAnsi="微软雅黑" w:eastAsia="微软雅黑"/>
+          <w:b w:val="0"/>
           <w:color w:val="444444"/>
           <w:sz w:val="20"/>
         </w:rPr>
-        <w:t>Spring Boot + Vue3 + JWT，用户登录认证与JWT令牌鉴权，Filter接口权限拦截，AOP操作日志记录。</w:t>
+        <w:t>独立完成 Java 后端开发，设计并实现 5 个 REST API 接口（增删改查）</w:t>
+      </w:r>
+    </w:p>
+    <w:p>
+      <w:pPr>
+        <w:pStyle w:val="ListBullet"/>
+      </w:pPr>
+      <w:r>
+        <w:rPr>
+          <w:rFonts w:ascii="微软雅黑" w:hAnsi="微软雅黑" w:eastAsia="微软雅黑"/>
+          <w:b w:val="0"/>
+          <w:color w:val="444444"/>
+          <w:sz w:val="20"/>
+        </w:rPr>
+        <w:t>使用 MySQL 完成数据持久化，规范接口设计与异常处理</w:t>
       </w:r>
     </w:p>
     <w:p>
@@ -475,10 +603,11 @@
       <w:r>
         <w:rPr>
           <w:rFonts w:ascii="微软雅黑" w:hAnsi="微软雅黑" w:eastAsia="微软雅黑"/>
+          <w:b w:val="0"/>
           <w:color w:val="444444"/>
           <w:sz w:val="20"/>
         </w:rPr>
-        <w:t>从新疆到南京，一路独立走过来，有完整全栈项目落地经验</w:t>
+        <w:t>从新疆到南京独立求学，具备从需求分析到部署上线的完整项目经验</w:t>
       </w:r>
     </w:p>
     <w:p>
@@ -488,10 +617,11 @@
       <w:r>
         <w:rPr>
           <w:rFonts w:ascii="微软雅黑" w:hAnsi="微软雅黑" w:eastAsia="微软雅黑"/>
+          <w:b w:val="0"/>
           <w:color w:val="444444"/>
           <w:sz w:val="20"/>
         </w:rPr>
-        <w:t>AI辅助编程能力：Vibe Coding、GitHub Copilot、Coze平台、硅基流动API，能利用AI工具快速定位问题、提升开发效率</w:t>
+        <w:t>熟悉 AI 辅助编程工具（Cursor、Copilot、Coze），能结合大模型 API 快速完成业务开发</w:t>
       </w:r>
     </w:p>
     <w:p>
@@ -501,10 +631,11 @@
       <w:r>
         <w:rPr>
           <w:rFonts w:ascii="微软雅黑" w:hAnsi="微软雅黑" w:eastAsia="微软雅黑"/>
+          <w:b w:val="0"/>
           <w:color w:val="444444"/>
           <w:sz w:val="20"/>
         </w:rPr>
-        <w:t>学习能力强，大一期间自学Spring Boot、Vue3、MyBatis并落地项目，目标暑假找Java后端实习攒经验</w:t>
+        <w:t>学习能力强，大一下学期自学 Spring Boot、Vue3、MyBatis 并落地多个全栈项目</w:t>
       </w:r>
     </w:p>
     <w:sectPr>

</xml_diff>